<commit_message>
Record targeted enrichment review and thesis findings
</commit_message>
<xml_diff>
--- a/docs/dissertation/Pasal_Thesis_Working_Draft.docx
+++ b/docs/dissertation/Pasal_Thesis_Working_Draft.docx
@@ -947,7 +947,17 @@
     </w:p>
     <w:p>
       <w:r>
-        <w:t>A training-only selection analysis estimated that a targeted 128-item set could expose 20,290 content-route users, or 2.91%, compared with 293 for a uniform set of the same size. These counts assume every selected output is approved and measure in-sample potential, not future exposure or effect size. The targeted sample is still being generated under conservative Free-tier quotas. Its final failure, approval, usage and ranking outcomes remain unreported until complete.</w:t>
+        <w:t>A training-only selection analysis estimated that a targeted 128-item set could expose 20,290 content-route users, or 2.91%, compared with 293 for a uniform set of the same size. These counts assume every selected output is approved and measure in-sample potential, not future exposure or effect size. The targeted sample is still being generated under conservative Free-tier quotas. Its final failure, approval, usage and ranking outcomes will be reported after completion.</w:t>
+      </w:r>
+    </w:p>
+    <w:p>
+      <w:r>
+        <w:t>At the eighth operational checkpoint, 98 of 128 declared items had been attempted: 69 outputs passed schema validation and 29 attempts failed or were rejected during generation. Assistant grounding screening approved 41 outputs and rejected 28; none of the 69 schema-valid outputs remained unreviewed. Thirty items were still unattempted when the conservative rolling daily quota stopped generation. These are incomplete-sample counts, not final quality estimates. Recorded usage totalled 35,641 input and 34,329 output tokens, excluding unavailable usage for 29 failures. The evidence is recorded in docs/genai-targeted-batch-8-results.json.</w:t>
+      </w:r>
+    </w:p>
+    <w:p>
+      <w:r>
+        <w:t>Rejected outputs included unsupported present-day availability claims, category codes presented as item identities, and omitted source-property citations for asserted facts. Accepted outputs often only restated anonymous property names or explicit historical availability flags. Acceptance therefore indicates source consistency under assistant screening, not meaningful semantic enrichment or independent human judgement. No targeted-treatment ranking benefit is asserted.</w:t>
       </w:r>
     </w:p>
     <w:p>

</xml_diff>